<commit_message>
Arraya, objects, functions and updated notes
</commit_message>
<xml_diff>
--- a/Bascis-JS/notes_14052025.docx
+++ b/Bascis-JS/notes_14052025.docx
@@ -21,6 +21,578 @@
           <w:szCs w:val="28"/>
           <w:u w:val="single"/>
         </w:rPr>
+        <w:t>Git Hub Introduction</w:t>
+      </w:r>
+    </w:p>
+    <w:p>
+      <w:pPr>
+        <w:rPr>
+          <w:rFonts w:ascii="Calibri" w:hAnsi="Calibri" w:cs="Calibri"/>
+        </w:rPr>
+      </w:pPr>
+      <w:r>
+        <w:rPr>
+          <w:rFonts w:ascii="Calibri" w:hAnsi="Calibri" w:cs="Calibri"/>
+          <w:b/>
+          <w:bCs/>
+        </w:rPr>
+        <w:t>Step1:</w:t>
+      </w:r>
+      <w:r>
+        <w:rPr>
+          <w:rFonts w:ascii="Calibri" w:hAnsi="Calibri" w:cs="Calibri"/>
+          <w:b/>
+          <w:bCs/>
+        </w:rPr>
+        <w:t xml:space="preserve"> </w:t>
+      </w:r>
+      <w:r>
+        <w:rPr>
+          <w:rFonts w:ascii="Calibri" w:hAnsi="Calibri" w:cs="Calibri"/>
+        </w:rPr>
+        <w:t>Download git  software and install</w:t>
+      </w:r>
+    </w:p>
+    <w:p>
+      <w:pPr>
+        <w:rPr>
+          <w:rFonts w:ascii="Calibri" w:hAnsi="Calibri" w:cs="Calibri"/>
+        </w:rPr>
+      </w:pPr>
+      <w:hyperlink r:id="rId5" w:history="1">
+        <w:r>
+          <w:rPr>
+            <w:rStyle w:val="Hyperlink"/>
+            <w:rFonts w:ascii="Calibri" w:hAnsi="Calibri" w:cs="Calibri"/>
+          </w:rPr>
+          <w:t>https://git-scm.com/downloads/win</w:t>
+        </w:r>
+      </w:hyperlink>
+    </w:p>
+    <w:p>
+      <w:pPr>
+        <w:rPr>
+          <w:rFonts w:ascii="Calibri" w:hAnsi="Calibri" w:cs="Calibri"/>
+        </w:rPr>
+      </w:pPr>
+    </w:p>
+    <w:p>
+      <w:pPr>
+        <w:rPr>
+          <w:rFonts w:ascii="Calibri" w:hAnsi="Calibri" w:cs="Calibri"/>
+        </w:rPr>
+      </w:pPr>
+      <w:r>
+        <w:rPr>
+          <w:rFonts w:ascii="Calibri" w:hAnsi="Calibri" w:cs="Calibri"/>
+          <w:b/>
+          <w:bCs/>
+        </w:rPr>
+        <w:t xml:space="preserve">Step2: </w:t>
+      </w:r>
+      <w:r>
+        <w:rPr>
+          <w:rFonts w:ascii="Calibri" w:hAnsi="Calibri" w:cs="Calibri"/>
+        </w:rPr>
+        <w:t>Install the software. After installation of software, you can see the icons showing some agreement license(Click on next, default branch: master, click next and finish)</w:t>
+      </w:r>
+    </w:p>
+    <w:p>
+      <w:pPr>
+        <w:rPr>
+          <w:rFonts w:ascii="Calibri" w:hAnsi="Calibri" w:cs="Calibri"/>
+        </w:rPr>
+      </w:pPr>
+    </w:p>
+    <w:p>
+      <w:pPr>
+        <w:rPr>
+          <w:rFonts w:ascii="Calibri" w:hAnsi="Calibri" w:cs="Calibri"/>
+        </w:rPr>
+      </w:pPr>
+      <w:r>
+        <w:rPr>
+          <w:rFonts w:ascii="Calibri" w:hAnsi="Calibri" w:cs="Calibri"/>
+          <w:b/>
+          <w:bCs/>
+        </w:rPr>
+        <w:t xml:space="preserve">Step3: </w:t>
+      </w:r>
+      <w:r>
+        <w:rPr>
+          <w:rFonts w:ascii="Calibri" w:hAnsi="Calibri" w:cs="Calibri"/>
+        </w:rPr>
+        <w:t>Check the git software by using the version. Open command prompt and type git –version</w:t>
+      </w:r>
+    </w:p>
+    <w:p>
+      <w:pPr>
+        <w:rPr>
+          <w:rFonts w:ascii="Calibri" w:hAnsi="Calibri" w:cs="Calibri"/>
+        </w:rPr>
+      </w:pPr>
+      <w:r>
+        <w:rPr>
+          <w:rFonts w:ascii="Calibri" w:hAnsi="Calibri" w:cs="Calibri"/>
+        </w:rPr>
+        <w:tab/>
+      </w:r>
+      <w:r>
+        <w:rPr>
+          <w:rFonts w:ascii="Calibri" w:hAnsi="Calibri" w:cs="Calibri"/>
+        </w:rPr>
+        <w:tab/>
+      </w:r>
+      <w:r>
+        <w:rPr>
+          <w:rFonts w:ascii="Calibri" w:hAnsi="Calibri" w:cs="Calibri"/>
+        </w:rPr>
+        <w:tab/>
+      </w:r>
+      <w:r>
+        <w:rPr>
+          <w:rFonts w:ascii="Calibri" w:hAnsi="Calibri" w:cs="Calibri"/>
+        </w:rPr>
+        <w:tab/>
+      </w:r>
+      <w:r>
+        <w:rPr>
+          <w:rFonts w:ascii="Calibri" w:hAnsi="Calibri" w:cs="Calibri"/>
+        </w:rPr>
+        <w:tab/>
+        <w:t>OR</w:t>
+      </w:r>
+    </w:p>
+    <w:p>
+      <w:pPr>
+        <w:rPr>
+          <w:rFonts w:ascii="Calibri" w:hAnsi="Calibri" w:cs="Calibri"/>
+        </w:rPr>
+      </w:pPr>
+      <w:r>
+        <w:rPr>
+          <w:rFonts w:ascii="Calibri" w:hAnsi="Calibri" w:cs="Calibri"/>
+        </w:rPr>
+        <w:t>Open git software options and open git bash. Here options will display once you right click on anywhere in your local machine.</w:t>
+      </w:r>
+    </w:p>
+    <w:p>
+      <w:pPr>
+        <w:rPr>
+          <w:rFonts w:ascii="Calibri" w:hAnsi="Calibri" w:cs="Calibri"/>
+        </w:rPr>
+      </w:pPr>
+    </w:p>
+    <w:p>
+      <w:pPr>
+        <w:rPr>
+          <w:rFonts w:ascii="Calibri" w:hAnsi="Calibri" w:cs="Calibri"/>
+        </w:rPr>
+      </w:pPr>
+      <w:r>
+        <w:rPr>
+          <w:rFonts w:ascii="Calibri" w:hAnsi="Calibri" w:cs="Calibri"/>
+          <w:b/>
+          <w:bCs/>
+        </w:rPr>
+        <w:t xml:space="preserve">Step4: </w:t>
+      </w:r>
+      <w:r>
+        <w:rPr>
+          <w:rFonts w:ascii="Calibri" w:hAnsi="Calibri" w:cs="Calibri"/>
+        </w:rPr>
+        <w:t>git configuration: In command prompt, give below commands:</w:t>
+      </w:r>
+    </w:p>
+    <w:p>
+      <w:pPr>
+        <w:rPr>
+          <w:rFonts w:ascii="Calibri" w:hAnsi="Calibri" w:cs="Calibri"/>
+        </w:rPr>
+      </w:pPr>
+      <w:r>
+        <w:rPr>
+          <w:rFonts w:ascii="Calibri" w:hAnsi="Calibri" w:cs="Calibri"/>
+        </w:rPr>
+        <w:t>g</w:t>
+      </w:r>
+      <w:r>
+        <w:rPr>
+          <w:rFonts w:ascii="Calibri" w:hAnsi="Calibri" w:cs="Calibri"/>
+        </w:rPr>
+        <w:t>it config</w:t>
+      </w:r>
+      <w:r>
+        <w:rPr>
+          <w:rFonts w:ascii="Calibri" w:hAnsi="Calibri" w:cs="Calibri"/>
+        </w:rPr>
+        <w:t xml:space="preserve"> –global user.name “your name”</w:t>
+      </w:r>
+    </w:p>
+    <w:p>
+      <w:pPr>
+        <w:rPr>
+          <w:rFonts w:ascii="Calibri" w:hAnsi="Calibri" w:cs="Calibri"/>
+        </w:rPr>
+      </w:pPr>
+      <w:r>
+        <w:rPr>
+          <w:rFonts w:ascii="Calibri" w:hAnsi="Calibri" w:cs="Calibri"/>
+        </w:rPr>
+        <w:t>git config –global user.</w:t>
+      </w:r>
+      <w:r>
+        <w:rPr>
+          <w:rFonts w:ascii="Calibri" w:hAnsi="Calibri" w:cs="Calibri"/>
+        </w:rPr>
+        <w:t>email</w:t>
+      </w:r>
+      <w:r>
+        <w:rPr>
+          <w:rFonts w:ascii="Calibri" w:hAnsi="Calibri" w:cs="Calibri"/>
+        </w:rPr>
+        <w:t xml:space="preserve"> “your </w:t>
+      </w:r>
+      <w:r>
+        <w:rPr>
+          <w:rFonts w:ascii="Calibri" w:hAnsi="Calibri" w:cs="Calibri"/>
+        </w:rPr>
+        <w:t>email</w:t>
+      </w:r>
+      <w:r>
+        <w:rPr>
+          <w:rFonts w:ascii="Calibri" w:hAnsi="Calibri" w:cs="Calibri"/>
+        </w:rPr>
+        <w:t>”</w:t>
+      </w:r>
+    </w:p>
+    <w:p>
+      <w:pPr>
+        <w:rPr>
+          <w:rFonts w:ascii="Calibri" w:hAnsi="Calibri" w:cs="Calibri"/>
+        </w:rPr>
+      </w:pPr>
+      <w:r>
+        <w:rPr>
+          <w:rFonts w:ascii="Calibri" w:hAnsi="Calibri" w:cs="Calibri"/>
+        </w:rPr>
+        <w:t>git config –global user.</w:t>
+      </w:r>
+      <w:r>
+        <w:rPr>
+          <w:rFonts w:ascii="Calibri" w:hAnsi="Calibri" w:cs="Calibri"/>
+        </w:rPr>
+        <w:t>password</w:t>
+      </w:r>
+      <w:r>
+        <w:rPr>
+          <w:rFonts w:ascii="Calibri" w:hAnsi="Calibri" w:cs="Calibri"/>
+        </w:rPr>
+        <w:t xml:space="preserve"> “your </w:t>
+      </w:r>
+      <w:r>
+        <w:rPr>
+          <w:rFonts w:ascii="Calibri" w:hAnsi="Calibri" w:cs="Calibri"/>
+        </w:rPr>
+        <w:t>mail password</w:t>
+      </w:r>
+      <w:r>
+        <w:rPr>
+          <w:rFonts w:ascii="Calibri" w:hAnsi="Calibri" w:cs="Calibri"/>
+        </w:rPr>
+        <w:t>”</w:t>
+      </w:r>
+    </w:p>
+    <w:p>
+      <w:pPr>
+        <w:rPr>
+          <w:rFonts w:ascii="Calibri" w:hAnsi="Calibri" w:cs="Calibri"/>
+        </w:rPr>
+      </w:pPr>
+    </w:p>
+    <w:p>
+      <w:pPr>
+        <w:rPr>
+          <w:rFonts w:ascii="Calibri" w:hAnsi="Calibri" w:cs="Calibri"/>
+        </w:rPr>
+      </w:pPr>
+      <w:r>
+        <w:rPr>
+          <w:rFonts w:ascii="Calibri" w:hAnsi="Calibri" w:cs="Calibri"/>
+          <w:b/>
+          <w:bCs/>
+        </w:rPr>
+        <w:t xml:space="preserve">Step5: </w:t>
+      </w:r>
+      <w:r>
+        <w:rPr>
+          <w:rFonts w:ascii="Calibri" w:hAnsi="Calibri" w:cs="Calibri"/>
+        </w:rPr>
+        <w:t>Initialize git into the local folder.</w:t>
+      </w:r>
+      <w:r>
+        <w:rPr>
+          <w:rFonts w:ascii="Calibri" w:hAnsi="Calibri" w:cs="Calibri"/>
+        </w:rPr>
+        <w:t xml:space="preserve">  </w:t>
+      </w:r>
+      <w:r>
+        <w:rPr>
+          <w:rFonts w:ascii="Calibri" w:hAnsi="Calibri" w:cs="Calibri"/>
+        </w:rPr>
+        <w:t>Open terminal in the visual code and type git init. After the initialization, we can see master branch.</w:t>
+      </w:r>
+    </w:p>
+    <w:p>
+      <w:pPr>
+        <w:rPr>
+          <w:rFonts w:ascii="Calibri" w:hAnsi="Calibri" w:cs="Calibri"/>
+        </w:rPr>
+      </w:pPr>
+    </w:p>
+    <w:p>
+      <w:pPr>
+        <w:rPr>
+          <w:rFonts w:ascii="Calibri" w:hAnsi="Calibri" w:cs="Calibri"/>
+        </w:rPr>
+      </w:pPr>
+      <w:r>
+        <w:rPr>
+          <w:rFonts w:ascii="Calibri" w:hAnsi="Calibri" w:cs="Calibri"/>
+          <w:b/>
+          <w:bCs/>
+        </w:rPr>
+        <w:t xml:space="preserve">Step6: </w:t>
+      </w:r>
+      <w:r>
+        <w:rPr>
+          <w:rFonts w:ascii="Calibri" w:hAnsi="Calibri" w:cs="Calibri"/>
+        </w:rPr>
+        <w:t xml:space="preserve">We should move our files to master branch. Make sure those are saved before moving to master branch. For that, we need to move our changes to source control. Then move our changes to staged changes by using + symbol. </w:t>
+      </w:r>
+    </w:p>
+    <w:p>
+      <w:pPr>
+        <w:rPr>
+          <w:rFonts w:ascii="Calibri" w:hAnsi="Calibri" w:cs="Calibri"/>
+        </w:rPr>
+      </w:pPr>
+    </w:p>
+    <w:p>
+      <w:pPr>
+        <w:rPr>
+          <w:rFonts w:ascii="Calibri" w:hAnsi="Calibri" w:cs="Calibri"/>
+        </w:rPr>
+      </w:pPr>
+      <w:r>
+        <w:rPr>
+          <w:rFonts w:ascii="Calibri" w:hAnsi="Calibri" w:cs="Calibri"/>
+          <w:b/>
+          <w:bCs/>
+        </w:rPr>
+        <w:t xml:space="preserve">Step7: </w:t>
+      </w:r>
+      <w:r>
+        <w:rPr>
+          <w:rFonts w:ascii="Calibri" w:hAnsi="Calibri" w:cs="Calibri"/>
+        </w:rPr>
+        <w:t>After changes, give commit by entering required message. Then we need to publish our branch but before that make sure that our account should be configure with our Github account.</w:t>
+      </w:r>
+    </w:p>
+    <w:p>
+      <w:pPr>
+        <w:rPr>
+          <w:rFonts w:ascii="Calibri" w:hAnsi="Calibri" w:cs="Calibri"/>
+          <w:b/>
+          <w:bCs/>
+        </w:rPr>
+      </w:pPr>
+      <w:r>
+        <w:rPr>
+          <w:rFonts w:ascii="Calibri" w:hAnsi="Calibri" w:cs="Calibri"/>
+          <w:b/>
+          <w:bCs/>
+        </w:rPr>
+        <w:t>Note:</w:t>
+      </w:r>
+    </w:p>
+    <w:p>
+      <w:pPr>
+        <w:pStyle w:val="ListParagraph"/>
+        <w:numPr>
+          <w:ilvl w:val="0"/>
+          <w:numId w:val="4"/>
+        </w:numPr>
+        <w:rPr>
+          <w:rFonts w:ascii="Calibri" w:hAnsi="Calibri" w:cs="Calibri"/>
+          <w:b/>
+          <w:bCs/>
+        </w:rPr>
+      </w:pPr>
+      <w:r>
+        <w:rPr>
+          <w:rFonts w:ascii="Calibri" w:hAnsi="Calibri" w:cs="Calibri"/>
+        </w:rPr>
+        <w:t>Create a new branch everyday for your work. Move the newly created</w:t>
+      </w:r>
+      <w:r>
+        <w:rPr>
+          <w:rFonts w:ascii="Calibri" w:hAnsi="Calibri" w:cs="Calibri"/>
+        </w:rPr>
+        <w:t xml:space="preserve"> files into that branch.</w:t>
+      </w:r>
+    </w:p>
+    <w:p>
+      <w:pPr>
+        <w:pStyle w:val="ListParagraph"/>
+        <w:numPr>
+          <w:ilvl w:val="0"/>
+          <w:numId w:val="4"/>
+        </w:numPr>
+        <w:rPr>
+          <w:rFonts w:ascii="Calibri" w:hAnsi="Calibri" w:cs="Calibri"/>
+          <w:b/>
+          <w:bCs/>
+        </w:rPr>
+      </w:pPr>
+      <w:r>
+        <w:rPr>
+          <w:rFonts w:ascii="Calibri" w:hAnsi="Calibri" w:cs="Calibri"/>
+        </w:rPr>
+        <w:t>Before creating a new branch, always check which branch you are creating from.</w:t>
+      </w:r>
+    </w:p>
+    <w:p>
+      <w:pPr>
+        <w:pStyle w:val="ListParagraph"/>
+        <w:numPr>
+          <w:ilvl w:val="0"/>
+          <w:numId w:val="4"/>
+        </w:numPr>
+        <w:rPr>
+          <w:rFonts w:ascii="Calibri" w:hAnsi="Calibri" w:cs="Calibri"/>
+          <w:b/>
+          <w:bCs/>
+        </w:rPr>
+      </w:pPr>
+      <w:r>
+        <w:rPr>
+          <w:rFonts w:ascii="Calibri" w:hAnsi="Calibri" w:cs="Calibri"/>
+        </w:rPr>
+        <w:t>Before committing changes, ensure you are in correct branch.</w:t>
+      </w:r>
+    </w:p>
+    <w:p>
+      <w:pPr>
+        <w:pStyle w:val="ListParagraph"/>
+        <w:numPr>
+          <w:ilvl w:val="0"/>
+          <w:numId w:val="4"/>
+        </w:numPr>
+        <w:rPr>
+          <w:rFonts w:ascii="Calibri" w:hAnsi="Calibri" w:cs="Calibri"/>
+          <w:b/>
+          <w:bCs/>
+        </w:rPr>
+      </w:pPr>
+      <w:r>
+        <w:rPr>
+          <w:rFonts w:ascii="Calibri" w:hAnsi="Calibri" w:cs="Calibri"/>
+        </w:rPr>
+        <w:t>After creating a new project, make sure master/main branch has atleast one file pushed to the repository.</w:t>
+      </w:r>
+    </w:p>
+    <w:p>
+      <w:pPr>
+        <w:pStyle w:val="ListParagraph"/>
+        <w:numPr>
+          <w:ilvl w:val="0"/>
+          <w:numId w:val="4"/>
+        </w:numPr>
+        <w:rPr>
+          <w:rFonts w:ascii="Calibri" w:hAnsi="Calibri" w:cs="Calibri"/>
+          <w:b/>
+          <w:bCs/>
+        </w:rPr>
+      </w:pPr>
+      <w:r>
+        <w:rPr>
+          <w:rFonts w:ascii="Calibri" w:hAnsi="Calibri" w:cs="Calibri"/>
+        </w:rPr>
+        <w:t>Initialize and clone git init -</w:t>
+      </w:r>
+      <w:r>
+        <w:rPr>
+          <w:rFonts w:ascii="Calibri" w:hAnsi="Calibri" w:cs="Calibri"/>
+        </w:rPr>
+        <w:sym w:font="Wingdings" w:char="F0E0"/>
+      </w:r>
+      <w:r>
+        <w:rPr>
+          <w:rFonts w:ascii="Calibri" w:hAnsi="Calibri" w:cs="Calibri"/>
+        </w:rPr>
+        <w:t xml:space="preserve"> Initializes git in your local project.</w:t>
+      </w:r>
+    </w:p>
+    <w:p>
+      <w:pPr>
+        <w:pStyle w:val="ListParagraph"/>
+        <w:numPr>
+          <w:ilvl w:val="0"/>
+          <w:numId w:val="4"/>
+        </w:numPr>
+        <w:rPr>
+          <w:rFonts w:ascii="Calibri" w:hAnsi="Calibri" w:cs="Calibri"/>
+          <w:b/>
+          <w:bCs/>
+        </w:rPr>
+      </w:pPr>
+      <w:r>
+        <w:rPr>
+          <w:rFonts w:ascii="Calibri" w:hAnsi="Calibri" w:cs="Calibri"/>
+        </w:rPr>
+        <w:t>git clone &lt;repourl&gt; -</w:t>
+      </w:r>
+      <w:r>
+        <w:rPr>
+          <w:rFonts w:ascii="Calibri" w:hAnsi="Calibri" w:cs="Calibri"/>
+        </w:rPr>
+        <w:sym w:font="Wingdings" w:char="F0E0"/>
+      </w:r>
+      <w:r>
+        <w:rPr>
+          <w:rFonts w:ascii="Calibri" w:hAnsi="Calibri" w:cs="Calibri"/>
+        </w:rPr>
+        <w:t xml:space="preserve"> Clones a remote repository to your local machine. (do in git bash)</w:t>
+      </w:r>
+    </w:p>
+    <w:p>
+      <w:pPr>
+        <w:rPr>
+          <w:rFonts w:ascii="Calibri" w:hAnsi="Calibri" w:cs="Calibri"/>
+        </w:rPr>
+      </w:pPr>
+    </w:p>
+    <w:p>
+      <w:pPr>
+        <w:jc w:val="center"/>
+        <w:rPr>
+          <w:b/>
+          <w:bCs/>
+          <w:sz w:val="28"/>
+          <w:szCs w:val="28"/>
+          <w:u w:val="single"/>
+        </w:rPr>
+      </w:pPr>
+      <w:r>
+        <w:rPr>
+          <w:b/>
+          <w:bCs/>
+          <w:sz w:val="28"/>
+          <w:szCs w:val="28"/>
+          <w:u w:val="single"/>
+        </w:rPr>
+        <w:lastRenderedPageBreak/>
         <w:t>JAVA SCRIPT</w:t>
       </w:r>
     </w:p>
@@ -65,7 +637,7 @@
                     </pic:cNvPicPr>
                   </pic:nvPicPr>
                   <pic:blipFill>
-                    <a:blip r:embed="rId5">
+                    <a:blip r:embed="rId6">
                       <a:extLst>
                         <a:ext uri="{28A0092B-C50C-407E-A947-70E740481C1C}">
                           <a14:useLocalDpi xmlns:a14="http://schemas.microsoft.com/office/drawing/2010/main" val="0"/>
@@ -109,7 +681,7 @@
         </w:rPr>
         <w:t>JavaScript is a versatile, dynamically typed programming language used for interactive web applications, supporting both client-side and server-side development, and integrating seamlessly with </w:t>
       </w:r>
-      <w:hyperlink r:id="rId6" w:tgtFrame="_blank" w:tooltip="https://www.geeksforgeeks.org/html-tutorial/" w:history="1">
+      <w:hyperlink r:id="rId7" w:tgtFrame="_blank" w:tooltip="https://www.geeksforgeeks.org/html-tutorial/" w:history="1">
         <w:r>
           <w:rPr>
             <w:rStyle w:val="Hyperlink"/>
@@ -124,7 +696,7 @@
         </w:rPr>
         <w:t>,</w:t>
       </w:r>
-      <w:hyperlink r:id="rId7" w:tgtFrame="_blank" w:tooltip="https://www.geeksforgeeks.org/css-tutorial/" w:history="1">
+      <w:hyperlink r:id="rId8" w:tgtFrame="_blank" w:tooltip="https://www.geeksforgeeks.org/css-tutorial/" w:history="1">
         <w:r>
           <w:rPr>
             <w:rStyle w:val="Hyperlink"/>
@@ -234,7 +806,7 @@
                     </pic:cNvPicPr>
                   </pic:nvPicPr>
                   <pic:blipFill>
-                    <a:blip r:embed="rId8">
+                    <a:blip r:embed="rId9">
                       <a:extLst>
                         <a:ext uri="{28A0092B-C50C-407E-A947-70E740481C1C}">
                           <a14:useLocalDpi xmlns:a14="http://schemas.microsoft.com/office/drawing/2010/main" val="0"/>
@@ -580,7 +1152,7 @@
         </w:rPr>
         <w:t>is like a container that holds data that can be reused or updated later in the program. In JavaScript, variables are declared using the keywords</w:t>
       </w:r>
-      <w:hyperlink r:id="rId9" w:tgtFrame="_blank" w:tooltip="https://www.geeksforgeeks.org/javascript-var/" w:history="1">
+      <w:hyperlink r:id="rId10" w:tgtFrame="_blank" w:tooltip="https://www.geeksforgeeks.org/javascript-var/" w:history="1">
         <w:r>
           <w:rPr>
             <w:rStyle w:val="Hyperlink"/>
@@ -595,7 +1167,7 @@
         </w:rPr>
         <w:t>, </w:t>
       </w:r>
-      <w:hyperlink r:id="rId10" w:tgtFrame="_blank" w:tooltip="https://www.geeksforgeeks.org/javascript-let/" w:history="1">
+      <w:hyperlink r:id="rId11" w:tgtFrame="_blank" w:tooltip="https://www.geeksforgeeks.org/javascript-let/" w:history="1">
         <w:r>
           <w:rPr>
             <w:rStyle w:val="Hyperlink"/>
@@ -610,7 +1182,7 @@
         </w:rPr>
         <w:t>, or </w:t>
       </w:r>
-      <w:hyperlink r:id="rId11" w:tgtFrame="_blank" w:tooltip="https://www.geeksforgeeks.org/javascript-const/" w:history="1">
+      <w:hyperlink r:id="rId12" w:tgtFrame="_blank" w:tooltip="https://www.geeksforgeeks.org/javascript-const/" w:history="1">
         <w:r>
           <w:rPr>
             <w:rStyle w:val="Hyperlink"/>
@@ -1122,6 +1694,471 @@
         </w:rPr>
         <w:t>Let sym1=Symabol(“JavaScript”)</w:t>
       </w:r>
+    </w:p>
+    <w:p>
+      <w:pPr>
+        <w:rPr>
+          <w:rFonts w:ascii="Calibri" w:hAnsi="Calibri" w:cs="Calibri"/>
+          <w:b/>
+          <w:bCs/>
+        </w:rPr>
+      </w:pPr>
+      <w:r>
+        <w:rPr>
+          <w:rFonts w:ascii="Calibri" w:hAnsi="Calibri" w:cs="Calibri"/>
+          <w:b/>
+          <w:bCs/>
+        </w:rPr>
+        <w:t>Examples of Non-Primitive Datatypes:</w:t>
+      </w:r>
+    </w:p>
+    <w:p>
+      <w:pPr>
+        <w:rPr>
+          <w:rFonts w:ascii="Calibri" w:hAnsi="Calibri" w:cs="Calibri"/>
+        </w:rPr>
+      </w:pPr>
+      <w:r>
+        <w:rPr>
+          <w:rFonts w:ascii="Calibri" w:hAnsi="Calibri" w:cs="Calibri"/>
+          <w:b/>
+          <w:bCs/>
+          <w:u w:val="single"/>
+        </w:rPr>
+        <w:t>1.Array:</w:t>
+      </w:r>
+      <w:r>
+        <w:rPr>
+          <w:rFonts w:ascii="Calibri" w:hAnsi="Calibri" w:cs="Calibri"/>
+          <w:b/>
+          <w:bCs/>
+          <w:u w:val="single"/>
+        </w:rPr>
+        <w:t xml:space="preserve"> </w:t>
+      </w:r>
+      <w:r>
+        <w:rPr>
+          <w:rFonts w:ascii="Calibri" w:hAnsi="Calibri" w:cs="Calibri"/>
+        </w:rPr>
+        <w:t>It is a collection of values stored in a single variable. Each value in the array is stored at specific index starting from 0.</w:t>
+      </w:r>
+    </w:p>
+    <w:p>
+      <w:pPr>
+        <w:rPr>
+          <w:rFonts w:ascii="Calibri" w:hAnsi="Calibri" w:cs="Calibri"/>
+        </w:rPr>
+      </w:pPr>
+      <w:r>
+        <w:rPr>
+          <w:rFonts w:ascii="Calibri" w:hAnsi="Calibri" w:cs="Calibri"/>
+        </w:rPr>
+        <w:t>Synatx: [value1,value2, …. valueN]</w:t>
+      </w:r>
+    </w:p>
+    <w:p>
+      <w:pPr>
+        <w:rPr>
+          <w:rFonts w:ascii="Calibri" w:hAnsi="Calibri" w:cs="Calibri"/>
+        </w:rPr>
+      </w:pPr>
+      <w:r>
+        <w:rPr>
+          <w:rFonts w:ascii="Calibri" w:hAnsi="Calibri" w:cs="Calibri"/>
+        </w:rPr>
+        <w:t>Eg:</w:t>
+      </w:r>
+      <w:r>
+        <w:rPr>
+          <w:rFonts w:ascii="Consolas" w:eastAsia="Times New Roman" w:hAnsi="Consolas" w:cs="Times New Roman"/>
+          <w:color w:val="D4D4D4"/>
+          <w:kern w:val="0"/>
+          <w:sz w:val="21"/>
+          <w:szCs w:val="21"/>
+          <w:lang w:eastAsia="en-IN"/>
+          <w14:ligatures w14:val="none"/>
+        </w:rPr>
+        <w:t xml:space="preserve"> </w:t>
+      </w:r>
+      <w:r>
+        <w:rPr>
+          <w:rFonts w:ascii="Calibri" w:hAnsi="Calibri" w:cs="Calibri"/>
+        </w:rPr>
+        <w:t> let names=["Sravani", "Mounica", "Hari", "Rohith"] //string</w:t>
+      </w:r>
+    </w:p>
+    <w:p>
+      <w:pPr>
+        <w:rPr>
+          <w:rFonts w:ascii="Calibri" w:hAnsi="Calibri" w:cs="Calibri"/>
+        </w:rPr>
+      </w:pPr>
+      <w:r>
+        <w:rPr>
+          <w:rFonts w:ascii="Calibri" w:hAnsi="Calibri" w:cs="Calibri"/>
+        </w:rPr>
+        <w:t>Console.log(names[0])</w:t>
+      </w:r>
+    </w:p>
+    <w:p>
+      <w:pPr>
+        <w:rPr>
+          <w:rFonts w:ascii="Calibri" w:hAnsi="Calibri" w:cs="Calibri"/>
+        </w:rPr>
+      </w:pPr>
+      <w:r>
+        <w:rPr>
+          <w:rFonts w:ascii="Calibri" w:hAnsi="Calibri" w:cs="Calibri"/>
+        </w:rPr>
+        <w:lastRenderedPageBreak/>
+        <w:t>let yearofbirth=['1976', '2000', '2006'] //numbers</w:t>
+      </w:r>
+    </w:p>
+    <w:p>
+      <w:pPr>
+        <w:rPr>
+          <w:rFonts w:ascii="Calibri" w:hAnsi="Calibri" w:cs="Calibri"/>
+        </w:rPr>
+      </w:pPr>
+    </w:p>
+    <w:p>
+      <w:pPr>
+        <w:rPr>
+          <w:rFonts w:ascii="Calibri" w:hAnsi="Calibri" w:cs="Calibri"/>
+        </w:rPr>
+      </w:pPr>
+      <w:r>
+        <w:rPr>
+          <w:rFonts w:ascii="Calibri" w:hAnsi="Calibri" w:cs="Calibri"/>
+        </w:rPr>
+        <w:t>let bookDetails=["Harrypotter", '1975', true] //combined of numbers, strings, boolean</w:t>
+      </w:r>
+    </w:p>
+    <w:p>
+      <w:pPr>
+        <w:rPr>
+          <w:rFonts w:ascii="Calibri" w:hAnsi="Calibri" w:cs="Calibri"/>
+        </w:rPr>
+      </w:pPr>
+    </w:p>
+    <w:p>
+      <w:pPr>
+        <w:rPr>
+          <w:rFonts w:ascii="Calibri" w:hAnsi="Calibri" w:cs="Calibri"/>
+        </w:rPr>
+      </w:pPr>
+      <w:r>
+        <w:rPr>
+          <w:rFonts w:ascii="Calibri" w:hAnsi="Calibri" w:cs="Calibri"/>
+          <w:b/>
+          <w:bCs/>
+          <w:u w:val="single"/>
+        </w:rPr>
+        <w:t>2.Objects</w:t>
+      </w:r>
+      <w:r>
+        <w:rPr>
+          <w:rFonts w:ascii="Calibri" w:hAnsi="Calibri" w:cs="Calibri"/>
+          <w:b/>
+          <w:bCs/>
+        </w:rPr>
+        <w:t xml:space="preserve">: </w:t>
+      </w:r>
+      <w:r>
+        <w:rPr>
+          <w:rFonts w:ascii="Calibri" w:hAnsi="Calibri" w:cs="Calibri"/>
+        </w:rPr>
+        <w:t>It is a collection of key-value pairs. Each key is unique and each key maps to a value which can be any datatype like number, string, array or an object.</w:t>
+      </w:r>
+    </w:p>
+    <w:p>
+      <w:pPr>
+        <w:rPr>
+          <w:rFonts w:ascii="Calibri" w:hAnsi="Calibri" w:cs="Calibri"/>
+        </w:rPr>
+      </w:pPr>
+      <w:r>
+        <w:rPr>
+          <w:rFonts w:ascii="Calibri" w:hAnsi="Calibri" w:cs="Calibri"/>
+        </w:rPr>
+        <w:t>Syntax: {</w:t>
+      </w:r>
+    </w:p>
+    <w:p>
+      <w:pPr>
+        <w:rPr>
+          <w:rFonts w:ascii="Calibri" w:hAnsi="Calibri" w:cs="Calibri"/>
+        </w:rPr>
+      </w:pPr>
+      <w:r>
+        <w:rPr>
+          <w:rFonts w:ascii="Calibri" w:hAnsi="Calibri" w:cs="Calibri"/>
+        </w:rPr>
+        <w:tab/>
+      </w:r>
+      <w:r>
+        <w:rPr>
+          <w:rFonts w:ascii="Calibri" w:hAnsi="Calibri" w:cs="Calibri"/>
+        </w:rPr>
+        <w:tab/>
+        <w:t>Key1  :  Value1,</w:t>
+      </w:r>
+    </w:p>
+    <w:p>
+      <w:pPr>
+        <w:rPr>
+          <w:rFonts w:ascii="Calibri" w:hAnsi="Calibri" w:cs="Calibri"/>
+        </w:rPr>
+      </w:pPr>
+      <w:r>
+        <w:rPr>
+          <w:rFonts w:ascii="Calibri" w:hAnsi="Calibri" w:cs="Calibri"/>
+        </w:rPr>
+        <w:tab/>
+      </w:r>
+      <w:r>
+        <w:rPr>
+          <w:rFonts w:ascii="Calibri" w:hAnsi="Calibri" w:cs="Calibri"/>
+        </w:rPr>
+        <w:tab/>
+        <w:t>Key2  :  Value2</w:t>
+      </w:r>
+    </w:p>
+    <w:p>
+      <w:pPr>
+        <w:rPr>
+          <w:rFonts w:ascii="Calibri" w:hAnsi="Calibri" w:cs="Calibri"/>
+        </w:rPr>
+      </w:pPr>
+      <w:r>
+        <w:rPr>
+          <w:rFonts w:ascii="Calibri" w:hAnsi="Calibri" w:cs="Calibri"/>
+        </w:rPr>
+        <w:t>….</w:t>
+      </w:r>
+    </w:p>
+    <w:p>
+      <w:pPr>
+        <w:rPr>
+          <w:rFonts w:ascii="Calibri" w:hAnsi="Calibri" w:cs="Calibri"/>
+        </w:rPr>
+      </w:pPr>
+      <w:r>
+        <w:rPr>
+          <w:rFonts w:ascii="Calibri" w:hAnsi="Calibri" w:cs="Calibri"/>
+        </w:rPr>
+        <w:tab/>
+      </w:r>
+      <w:r>
+        <w:rPr>
+          <w:rFonts w:ascii="Calibri" w:hAnsi="Calibri" w:cs="Calibri"/>
+        </w:rPr>
+        <w:tab/>
+        <w:t>KeyN  : ValueN</w:t>
+      </w:r>
+    </w:p>
+    <w:p>
+      <w:pPr>
+        <w:rPr>
+          <w:rFonts w:ascii="Calibri" w:hAnsi="Calibri" w:cs="Calibri"/>
+        </w:rPr>
+      </w:pPr>
+      <w:r>
+        <w:rPr>
+          <w:rFonts w:ascii="Calibri" w:hAnsi="Calibri" w:cs="Calibri"/>
+        </w:rPr>
+        <w:tab/>
+        <w:t>};</w:t>
+      </w:r>
+    </w:p>
+    <w:p>
+      <w:pPr>
+        <w:rPr>
+          <w:rFonts w:ascii="Calibri" w:hAnsi="Calibri" w:cs="Calibri"/>
+        </w:rPr>
+      </w:pPr>
+    </w:p>
+    <w:p>
+      <w:pPr>
+        <w:rPr>
+          <w:rFonts w:ascii="Calibri" w:hAnsi="Calibri" w:cs="Calibri"/>
+        </w:rPr>
+      </w:pPr>
+      <w:r>
+        <w:rPr>
+          <w:rFonts w:ascii="Calibri" w:hAnsi="Calibri" w:cs="Calibri"/>
+        </w:rPr>
+        <w:t>Eg:</w:t>
+      </w:r>
+      <w:r>
+        <w:rPr>
+          <w:rFonts w:ascii="Consolas" w:eastAsia="Times New Roman" w:hAnsi="Consolas" w:cs="Times New Roman"/>
+          <w:color w:val="569CD6"/>
+          <w:kern w:val="0"/>
+          <w:sz w:val="21"/>
+          <w:szCs w:val="21"/>
+          <w:lang w:eastAsia="en-IN"/>
+          <w14:ligatures w14:val="none"/>
+        </w:rPr>
+        <w:t xml:space="preserve"> </w:t>
+      </w:r>
+      <w:r>
+        <w:rPr>
+          <w:rFonts w:ascii="Calibri" w:hAnsi="Calibri" w:cs="Calibri"/>
+        </w:rPr>
+        <w:t>let CustomerDetails={</w:t>
+      </w:r>
+    </w:p>
+    <w:p>
+      <w:pPr>
+        <w:rPr>
+          <w:rFonts w:ascii="Calibri" w:hAnsi="Calibri" w:cs="Calibri"/>
+        </w:rPr>
+      </w:pPr>
+      <w:r>
+        <w:rPr>
+          <w:rFonts w:ascii="Calibri" w:hAnsi="Calibri" w:cs="Calibri"/>
+        </w:rPr>
+        <w:t>                "Name": "Rohith" ,</w:t>
+      </w:r>
+    </w:p>
+    <w:p>
+      <w:pPr>
+        <w:rPr>
+          <w:rFonts w:ascii="Calibri" w:hAnsi="Calibri" w:cs="Calibri"/>
+        </w:rPr>
+      </w:pPr>
+      <w:r>
+        <w:rPr>
+          <w:rFonts w:ascii="Calibri" w:hAnsi="Calibri" w:cs="Calibri"/>
+        </w:rPr>
+        <w:t>                "Age": '20',</w:t>
+      </w:r>
+    </w:p>
+    <w:p>
+      <w:pPr>
+        <w:rPr>
+          <w:rFonts w:ascii="Calibri" w:hAnsi="Calibri" w:cs="Calibri"/>
+        </w:rPr>
+      </w:pPr>
+      <w:r>
+        <w:rPr>
+          <w:rFonts w:ascii="Calibri" w:hAnsi="Calibri" w:cs="Calibri"/>
+        </w:rPr>
+        <w:t>                "MobileNumber": "8668XXXXX"    </w:t>
+      </w:r>
+    </w:p>
+    <w:p>
+      <w:pPr>
+        <w:rPr>
+          <w:rFonts w:ascii="Calibri" w:hAnsi="Calibri" w:cs="Calibri"/>
+        </w:rPr>
+      </w:pPr>
+      <w:r>
+        <w:rPr>
+          <w:rFonts w:ascii="Calibri" w:hAnsi="Calibri" w:cs="Calibri"/>
+        </w:rPr>
+        <w:t>             }</w:t>
+      </w:r>
+    </w:p>
+    <w:p>
+      <w:pPr>
+        <w:rPr>
+          <w:rFonts w:ascii="Calibri" w:hAnsi="Calibri" w:cs="Calibri"/>
+        </w:rPr>
+      </w:pPr>
+      <w:r>
+        <w:rPr>
+          <w:rFonts w:ascii="Calibri" w:hAnsi="Calibri" w:cs="Calibri"/>
+        </w:rPr>
+        <w:t>console.log(CustomerDetails.Name)</w:t>
+      </w:r>
+    </w:p>
+    <w:p>
+      <w:pPr>
+        <w:rPr>
+          <w:rFonts w:ascii="Calibri" w:hAnsi="Calibri" w:cs="Calibri"/>
+        </w:rPr>
+      </w:pPr>
+      <w:r>
+        <w:rPr>
+          <w:rFonts w:ascii="Calibri" w:hAnsi="Calibri" w:cs="Calibri"/>
+          <w:b/>
+          <w:bCs/>
+          <w:u w:val="single"/>
+        </w:rPr>
+        <w:t>3.Functions:</w:t>
+      </w:r>
+      <w:r>
+        <w:rPr>
+          <w:rFonts w:ascii="Calibri" w:hAnsi="Calibri" w:cs="Calibri"/>
+          <w:b/>
+          <w:bCs/>
+          <w:u w:val="single"/>
+        </w:rPr>
+        <w:t xml:space="preserve"> </w:t>
+      </w:r>
+      <w:r>
+        <w:rPr>
+          <w:rFonts w:ascii="Calibri" w:hAnsi="Calibri" w:cs="Calibri"/>
+        </w:rPr>
+        <w:t>Function is also a non-primitive datatype.</w:t>
+      </w:r>
+    </w:p>
+    <w:p>
+      <w:pPr>
+        <w:rPr>
+          <w:rFonts w:ascii="Calibri" w:hAnsi="Calibri" w:cs="Calibri"/>
+        </w:rPr>
+      </w:pPr>
+      <w:r>
+        <w:rPr>
+          <w:rFonts w:ascii="Calibri" w:hAnsi="Calibri" w:cs="Calibri"/>
+        </w:rPr>
+        <w:t>Syntax: var dataname= function(){</w:t>
+      </w:r>
+    </w:p>
+    <w:p>
+      <w:pPr>
+        <w:rPr>
+          <w:rFonts w:ascii="Calibri" w:hAnsi="Calibri" w:cs="Calibri"/>
+        </w:rPr>
+      </w:pPr>
+    </w:p>
+    <w:p>
+      <w:pPr>
+        <w:rPr>
+          <w:rFonts w:ascii="Calibri" w:hAnsi="Calibri" w:cs="Calibri"/>
+        </w:rPr>
+      </w:pPr>
+      <w:r>
+        <w:rPr>
+          <w:rFonts w:ascii="Calibri" w:hAnsi="Calibri" w:cs="Calibri"/>
+        </w:rPr>
+        <w:t>}</w:t>
+      </w:r>
+    </w:p>
+    <w:p>
+      <w:pPr>
+        <w:rPr>
+          <w:rFonts w:ascii="Calibri" w:hAnsi="Calibri" w:cs="Calibri"/>
+          <w:u w:val="single"/>
+        </w:rPr>
+      </w:pPr>
+    </w:p>
+    <w:p>
+      <w:pPr>
+        <w:rPr>
+          <w:rFonts w:ascii="Calibri" w:hAnsi="Calibri" w:cs="Calibri"/>
+        </w:rPr>
+      </w:pPr>
+    </w:p>
+    <w:p>
+      <w:pPr>
+        <w:rPr>
+          <w:rFonts w:ascii="Calibri" w:hAnsi="Calibri" w:cs="Calibri"/>
+        </w:rPr>
+      </w:pPr>
     </w:p>
     <w:p>
       <w:pPr>
@@ -1246,6 +2283,119 @@
     </w:lvl>
   </w:abstractNum>
   <w:abstractNum w:abstractNumId="1" w15:restartNumberingAfterBreak="0">
+    <w:nsid w:val="3CC93DA0"/>
+    <w:multiLevelType w:val="hybridMultilevel"/>
+    <w:tmpl w:val="D304D14C"/>
+    <w:lvl w:ilvl="0" w:tplc="40090001">
+      <w:start w:val="1"/>
+      <w:numFmt w:val="bullet"/>
+      <w:lvlText w:val=""/>
+      <w:lvlJc w:val="left"/>
+      <w:pPr>
+        <w:ind w:left="720" w:hanging="360"/>
+      </w:pPr>
+      <w:rPr>
+        <w:rFonts w:ascii="Symbol" w:hAnsi="Symbol" w:hint="default"/>
+      </w:rPr>
+    </w:lvl>
+    <w:lvl w:ilvl="1" w:tplc="40090003" w:tentative="1">
+      <w:start w:val="1"/>
+      <w:numFmt w:val="bullet"/>
+      <w:lvlText w:val="o"/>
+      <w:lvlJc w:val="left"/>
+      <w:pPr>
+        <w:ind w:left="1440" w:hanging="360"/>
+      </w:pPr>
+      <w:rPr>
+        <w:rFonts w:ascii="Courier New" w:hAnsi="Courier New" w:cs="Courier New" w:hint="default"/>
+      </w:rPr>
+    </w:lvl>
+    <w:lvl w:ilvl="2" w:tplc="40090005" w:tentative="1">
+      <w:start w:val="1"/>
+      <w:numFmt w:val="bullet"/>
+      <w:lvlText w:val=""/>
+      <w:lvlJc w:val="left"/>
+      <w:pPr>
+        <w:ind w:left="2160" w:hanging="360"/>
+      </w:pPr>
+      <w:rPr>
+        <w:rFonts w:ascii="Wingdings" w:hAnsi="Wingdings" w:hint="default"/>
+      </w:rPr>
+    </w:lvl>
+    <w:lvl w:ilvl="3" w:tplc="40090001" w:tentative="1">
+      <w:start w:val="1"/>
+      <w:numFmt w:val="bullet"/>
+      <w:lvlText w:val=""/>
+      <w:lvlJc w:val="left"/>
+      <w:pPr>
+        <w:ind w:left="2880" w:hanging="360"/>
+      </w:pPr>
+      <w:rPr>
+        <w:rFonts w:ascii="Symbol" w:hAnsi="Symbol" w:hint="default"/>
+      </w:rPr>
+    </w:lvl>
+    <w:lvl w:ilvl="4" w:tplc="40090003" w:tentative="1">
+      <w:start w:val="1"/>
+      <w:numFmt w:val="bullet"/>
+      <w:lvlText w:val="o"/>
+      <w:lvlJc w:val="left"/>
+      <w:pPr>
+        <w:ind w:left="3600" w:hanging="360"/>
+      </w:pPr>
+      <w:rPr>
+        <w:rFonts w:ascii="Courier New" w:hAnsi="Courier New" w:cs="Courier New" w:hint="default"/>
+      </w:rPr>
+    </w:lvl>
+    <w:lvl w:ilvl="5" w:tplc="40090005" w:tentative="1">
+      <w:start w:val="1"/>
+      <w:numFmt w:val="bullet"/>
+      <w:lvlText w:val=""/>
+      <w:lvlJc w:val="left"/>
+      <w:pPr>
+        <w:ind w:left="4320" w:hanging="360"/>
+      </w:pPr>
+      <w:rPr>
+        <w:rFonts w:ascii="Wingdings" w:hAnsi="Wingdings" w:hint="default"/>
+      </w:rPr>
+    </w:lvl>
+    <w:lvl w:ilvl="6" w:tplc="40090001" w:tentative="1">
+      <w:start w:val="1"/>
+      <w:numFmt w:val="bullet"/>
+      <w:lvlText w:val=""/>
+      <w:lvlJc w:val="left"/>
+      <w:pPr>
+        <w:ind w:left="5040" w:hanging="360"/>
+      </w:pPr>
+      <w:rPr>
+        <w:rFonts w:ascii="Symbol" w:hAnsi="Symbol" w:hint="default"/>
+      </w:rPr>
+    </w:lvl>
+    <w:lvl w:ilvl="7" w:tplc="40090003" w:tentative="1">
+      <w:start w:val="1"/>
+      <w:numFmt w:val="bullet"/>
+      <w:lvlText w:val="o"/>
+      <w:lvlJc w:val="left"/>
+      <w:pPr>
+        <w:ind w:left="5760" w:hanging="360"/>
+      </w:pPr>
+      <w:rPr>
+        <w:rFonts w:ascii="Courier New" w:hAnsi="Courier New" w:cs="Courier New" w:hint="default"/>
+      </w:rPr>
+    </w:lvl>
+    <w:lvl w:ilvl="8" w:tplc="40090005" w:tentative="1">
+      <w:start w:val="1"/>
+      <w:numFmt w:val="bullet"/>
+      <w:lvlText w:val=""/>
+      <w:lvlJc w:val="left"/>
+      <w:pPr>
+        <w:ind w:left="6480" w:hanging="360"/>
+      </w:pPr>
+      <w:rPr>
+        <w:rFonts w:ascii="Wingdings" w:hAnsi="Wingdings" w:hint="default"/>
+      </w:rPr>
+    </w:lvl>
+  </w:abstractNum>
+  <w:abstractNum w:abstractNumId="2" w15:restartNumberingAfterBreak="0">
     <w:nsid w:val="57A10B6C"/>
     <w:multiLevelType w:val="multilevel"/>
     <w:tmpl w:val="99B43B9C"/>
@@ -1394,7 +2544,7 @@
       </w:rPr>
     </w:lvl>
   </w:abstractNum>
-  <w:abstractNum w:abstractNumId="2" w15:restartNumberingAfterBreak="0">
+  <w:abstractNum w:abstractNumId="3" w15:restartNumberingAfterBreak="0">
     <w:nsid w:val="5B1D424A"/>
     <w:multiLevelType w:val="multilevel"/>
     <w:tmpl w:val="B59A427A"/>
@@ -1544,13 +2694,16 @@
     </w:lvl>
   </w:abstractNum>
   <w:num w:numId="1" w16cid:durableId="595099240">
-    <w:abstractNumId w:val="1"/>
+    <w:abstractNumId w:val="2"/>
   </w:num>
   <w:num w:numId="2" w16cid:durableId="1813980021">
-    <w:abstractNumId w:val="2"/>
+    <w:abstractNumId w:val="3"/>
   </w:num>
   <w:num w:numId="3" w16cid:durableId="937519047">
     <w:abstractNumId w:val="0"/>
+  </w:num>
+  <w:num w:numId="4" w16cid:durableId="430515380">
+    <w:abstractNumId w:val="1"/>
   </w:num>
 </w:numbering>
 </file>
@@ -2158,7 +3311,6 @@
   <w:style w:type="character" w:default="1" w:styleId="DefaultParagraphFont">
     <w:name w:val="Default Paragraph Font"/>
     <w:uiPriority w:val="1"/>
-    <w:semiHidden/>
     <w:unhideWhenUsed/>
   </w:style>
   <w:style w:type="table" w:default="1" w:styleId="TableNormal">

</xml_diff>

<commit_message>
Practice for 3rd June
</commit_message>
<xml_diff>
--- a/Bascis-JS/notes_14052025.docx
+++ b/Bascis-JS/notes_14052025.docx
@@ -6313,6 +6313,39 @@
         </w:rPr>
         <w:t>(shift+f11)</w:t>
       </w:r>
+    </w:p>
+    <w:p>
+      <w:pPr>
+        <w:ind w:left="1080"/>
+        <w:jc w:val="center"/>
+        <w:rPr>
+          <w:rFonts w:ascii="Calibri" w:hAnsi="Calibri" w:cs="Calibri"/>
+          <w:b/>
+          <w:bCs/>
+          <w:u w:val="single"/>
+        </w:rPr>
+      </w:pPr>
+      <w:r>
+        <w:rPr>
+          <w:rFonts w:ascii="Calibri" w:hAnsi="Calibri" w:cs="Calibri"/>
+          <w:b/>
+          <w:bCs/>
+          <w:highlight w:val="yellow"/>
+          <w:u w:val="single"/>
+        </w:rPr>
+        <w:t>Members of complex datatypes</w:t>
+      </w:r>
+    </w:p>
+    <w:p>
+      <w:pPr>
+        <w:ind w:left="1080"/>
+        <w:rPr>
+          <w:rFonts w:ascii="Calibri" w:hAnsi="Calibri" w:cs="Calibri"/>
+          <w:b/>
+          <w:bCs/>
+          <w:u w:val="single"/>
+        </w:rPr>
+      </w:pPr>
     </w:p>
     <w:p>
       <w:pPr>

</xml_diff>

<commit_message>
For..of, For..in, while and for loop
</commit_message>
<xml_diff>
--- a/Bascis-JS/notes_14052025.docx
+++ b/Bascis-JS/notes_14052025.docx
@@ -6349,6 +6349,639 @@
     </w:p>
     <w:p>
       <w:pPr>
+        <w:ind w:left="1080"/>
+        <w:rPr>
+          <w:rFonts w:ascii="Calibri" w:hAnsi="Calibri" w:cs="Calibri"/>
+        </w:rPr>
+      </w:pPr>
+      <w:r>
+        <w:rPr>
+          <w:rFonts w:ascii="Calibri" w:hAnsi="Calibri" w:cs="Calibri"/>
+        </w:rPr>
+        <w:t>In JS, a member refers to both the properties and methods that belong to an object, array, function (or) other data type.</w:t>
+      </w:r>
+    </w:p>
+    <w:p>
+      <w:pPr>
+        <w:ind w:left="1080"/>
+        <w:rPr>
+          <w:rFonts w:ascii="Calibri" w:hAnsi="Calibri" w:cs="Calibri"/>
+        </w:rPr>
+      </w:pPr>
+      <w:r>
+        <w:rPr>
+          <w:rFonts w:ascii="Calibri" w:hAnsi="Calibri" w:cs="Calibri"/>
+        </w:rPr>
+        <w:t>Members are 2 types:</w:t>
+      </w:r>
+    </w:p>
+    <w:p>
+      <w:pPr>
+        <w:pStyle w:val="ListParagraph"/>
+        <w:numPr>
+          <w:ilvl w:val="0"/>
+          <w:numId w:val="10"/>
+        </w:numPr>
+        <w:rPr>
+          <w:rFonts w:ascii="Calibri" w:hAnsi="Calibri" w:cs="Calibri"/>
+          <w:b/>
+          <w:bCs/>
+          <w:u w:val="single"/>
+        </w:rPr>
+      </w:pPr>
+      <w:r>
+        <w:rPr>
+          <w:rFonts w:ascii="Calibri" w:hAnsi="Calibri" w:cs="Calibri"/>
+          <w:b/>
+          <w:bCs/>
+          <w:u w:val="single"/>
+        </w:rPr>
+        <w:t xml:space="preserve">Property: </w:t>
+      </w:r>
+      <w:r>
+        <w:rPr>
+          <w:rFonts w:ascii="Calibri" w:hAnsi="Calibri" w:cs="Calibri"/>
+        </w:rPr>
+        <w:t>It is a value that belongs to a data type holding the data.</w:t>
+      </w:r>
+    </w:p>
+    <w:p>
+      <w:pPr>
+        <w:pStyle w:val="ListParagraph"/>
+        <w:numPr>
+          <w:ilvl w:val="0"/>
+          <w:numId w:val="10"/>
+        </w:numPr>
+        <w:rPr>
+          <w:rFonts w:ascii="Calibri" w:hAnsi="Calibri" w:cs="Calibri"/>
+          <w:b/>
+          <w:bCs/>
+          <w:u w:val="single"/>
+        </w:rPr>
+      </w:pPr>
+      <w:r>
+        <w:rPr>
+          <w:rFonts w:ascii="Calibri" w:hAnsi="Calibri" w:cs="Calibri"/>
+          <w:b/>
+          <w:bCs/>
+          <w:u w:val="single"/>
+        </w:rPr>
+        <w:lastRenderedPageBreak/>
+        <w:t xml:space="preserve">Method: </w:t>
+      </w:r>
+      <w:r>
+        <w:rPr>
+          <w:rFonts w:ascii="Calibri" w:hAnsi="Calibri" w:cs="Calibri"/>
+        </w:rPr>
+        <w:t>It is a function that performs a specific action and can access or manipulate the data.</w:t>
+      </w:r>
+    </w:p>
+    <w:p>
+      <w:pPr>
+        <w:ind w:left="1080"/>
+        <w:rPr>
+          <w:rFonts w:ascii="Calibri" w:hAnsi="Calibri" w:cs="Calibri"/>
+          <w:b/>
+          <w:bCs/>
+          <w:u w:val="single"/>
+        </w:rPr>
+      </w:pPr>
+      <w:r>
+        <w:rPr>
+          <w:rFonts w:ascii="Calibri" w:hAnsi="Calibri" w:cs="Calibri"/>
+          <w:b/>
+          <w:bCs/>
+          <w:u w:val="single"/>
+        </w:rPr>
+        <w:t>For ex:</w:t>
+      </w:r>
+    </w:p>
+    <w:p>
+      <w:pPr>
+        <w:ind w:left="1080"/>
+        <w:rPr>
+          <w:rFonts w:ascii="Calibri" w:hAnsi="Calibri" w:cs="Calibri"/>
+        </w:rPr>
+      </w:pPr>
+      <w:r>
+        <w:rPr>
+          <w:rFonts w:ascii="Calibri" w:hAnsi="Calibri" w:cs="Calibri"/>
+        </w:rPr>
+        <w:t>Let car = {</w:t>
+      </w:r>
+    </w:p>
+    <w:p>
+      <w:pPr>
+        <w:ind w:left="1080"/>
+        <w:rPr>
+          <w:rFonts w:ascii="Calibri" w:hAnsi="Calibri" w:cs="Calibri"/>
+        </w:rPr>
+      </w:pPr>
+      <w:r>
+        <w:rPr>
+          <w:rFonts w:ascii="Calibri" w:hAnsi="Calibri" w:cs="Calibri"/>
+        </w:rPr>
+        <w:t>Brand: “Toyota”,</w:t>
+      </w:r>
+    </w:p>
+    <w:p>
+      <w:pPr>
+        <w:ind w:left="1080"/>
+        <w:rPr>
+          <w:rFonts w:ascii="Calibri" w:hAnsi="Calibri" w:cs="Calibri"/>
+        </w:rPr>
+      </w:pPr>
+      <w:r>
+        <w:rPr>
+          <w:rFonts w:ascii="Calibri" w:hAnsi="Calibri" w:cs="Calibri"/>
+        </w:rPr>
+        <w:t xml:space="preserve">Drive: </w:t>
+      </w:r>
+      <w:proofErr w:type="gramStart"/>
+      <w:r>
+        <w:rPr>
+          <w:rFonts w:ascii="Calibri" w:hAnsi="Calibri" w:cs="Calibri"/>
+        </w:rPr>
+        <w:t>function(</w:t>
+      </w:r>
+      <w:proofErr w:type="gramEnd"/>
+      <w:r>
+        <w:rPr>
+          <w:rFonts w:ascii="Calibri" w:hAnsi="Calibri" w:cs="Calibri"/>
+        </w:rPr>
+        <w:t>){</w:t>
+      </w:r>
+    </w:p>
+    <w:p>
+      <w:pPr>
+        <w:ind w:left="1080"/>
+        <w:rPr>
+          <w:rFonts w:ascii="Calibri" w:hAnsi="Calibri" w:cs="Calibri"/>
+        </w:rPr>
+      </w:pPr>
+      <w:r>
+        <w:rPr>
+          <w:rFonts w:ascii="Calibri" w:hAnsi="Calibri" w:cs="Calibri"/>
+        </w:rPr>
+        <w:tab/>
+        <w:t xml:space="preserve">     Console.log(“Driving”</w:t>
+      </w:r>
+      <w:proofErr w:type="gramStart"/>
+      <w:r>
+        <w:rPr>
+          <w:rFonts w:ascii="Calibri" w:hAnsi="Calibri" w:cs="Calibri"/>
+        </w:rPr>
+        <w:t>);</w:t>
+      </w:r>
+      <w:proofErr w:type="gramEnd"/>
+    </w:p>
+    <w:p>
+      <w:pPr>
+        <w:ind w:left="1080"/>
+        <w:rPr>
+          <w:rFonts w:ascii="Calibri" w:hAnsi="Calibri" w:cs="Calibri"/>
+        </w:rPr>
+      </w:pPr>
+      <w:r>
+        <w:rPr>
+          <w:rFonts w:ascii="Calibri" w:hAnsi="Calibri" w:cs="Calibri"/>
+        </w:rPr>
+        <w:t>}</w:t>
+      </w:r>
+    </w:p>
+    <w:p>
+      <w:pPr>
+        <w:ind w:left="1080"/>
+        <w:rPr>
+          <w:rFonts w:ascii="Calibri" w:hAnsi="Calibri" w:cs="Calibri"/>
+        </w:rPr>
+      </w:pPr>
+      <w:r>
+        <w:rPr>
+          <w:rFonts w:ascii="Calibri" w:hAnsi="Calibri" w:cs="Calibri"/>
+        </w:rPr>
+        <w:t>};</w:t>
+      </w:r>
+    </w:p>
+    <w:p>
+      <w:pPr>
+        <w:rPr>
+          <w:rFonts w:ascii="Calibri" w:hAnsi="Calibri" w:cs="Calibri"/>
+        </w:rPr>
+      </w:pPr>
+      <w:r>
+        <w:rPr>
+          <w:rFonts w:ascii="Calibri" w:hAnsi="Calibri" w:cs="Calibri"/>
+        </w:rPr>
+        <w:tab/>
+        <w:t xml:space="preserve">//here brand is property and </w:t>
+      </w:r>
+      <w:proofErr w:type="gramStart"/>
+      <w:r>
+        <w:rPr>
+          <w:rFonts w:ascii="Calibri" w:hAnsi="Calibri" w:cs="Calibri"/>
+        </w:rPr>
+        <w:t>drive(</w:t>
+      </w:r>
+      <w:proofErr w:type="gramEnd"/>
+      <w:r>
+        <w:rPr>
+          <w:rFonts w:ascii="Calibri" w:hAnsi="Calibri" w:cs="Calibri"/>
+        </w:rPr>
+        <w:t>) is a Method.</w:t>
+      </w:r>
+    </w:p>
+    <w:p>
+      <w:pPr>
+        <w:jc w:val="center"/>
+        <w:rPr>
+          <w:rFonts w:ascii="Calibri" w:hAnsi="Calibri" w:cs="Calibri"/>
+          <w:b/>
+          <w:bCs/>
+          <w:u w:val="single"/>
+        </w:rPr>
+      </w:pPr>
+      <w:r>
+        <w:rPr>
+          <w:rFonts w:ascii="Calibri" w:hAnsi="Calibri" w:cs="Calibri"/>
+          <w:b/>
+          <w:bCs/>
+          <w:highlight w:val="yellow"/>
+          <w:u w:val="single"/>
+        </w:rPr>
+        <w:t>This Keyword</w:t>
+      </w:r>
+    </w:p>
+    <w:p>
+      <w:pPr>
+        <w:rPr>
+          <w:rFonts w:ascii="Calibri" w:hAnsi="Calibri" w:cs="Calibri"/>
+        </w:rPr>
+      </w:pPr>
+      <w:r>
+        <w:rPr>
+          <w:rFonts w:ascii="Calibri" w:hAnsi="Calibri" w:cs="Calibri"/>
+        </w:rPr>
+        <w:t xml:space="preserve">This Keyword in JS refers to the context (or) object that is currently executing the code and </w:t>
+      </w:r>
+      <w:proofErr w:type="gramStart"/>
+      <w:r>
+        <w:rPr>
+          <w:rFonts w:ascii="Calibri" w:hAnsi="Calibri" w:cs="Calibri"/>
+        </w:rPr>
+        <w:t>it’s</w:t>
+      </w:r>
+      <w:proofErr w:type="gramEnd"/>
+      <w:r>
+        <w:rPr>
+          <w:rFonts w:ascii="Calibri" w:hAnsi="Calibri" w:cs="Calibri"/>
+        </w:rPr>
+        <w:t xml:space="preserve"> value is determined by the calling environment</w:t>
+      </w:r>
+    </w:p>
+    <w:p>
+      <w:pPr>
+        <w:rPr>
+          <w:rFonts w:ascii="Calibri" w:hAnsi="Calibri" w:cs="Calibri"/>
+        </w:rPr>
+      </w:pPr>
+      <w:r>
+        <w:rPr>
+          <w:rFonts w:ascii="Calibri" w:hAnsi="Calibri" w:cs="Calibri"/>
+          <w:b/>
+          <w:bCs/>
+          <w:u w:val="single"/>
+        </w:rPr>
+        <w:t>Global Context:</w:t>
+      </w:r>
+      <w:r>
+        <w:rPr>
+          <w:rFonts w:ascii="Calibri" w:hAnsi="Calibri" w:cs="Calibri"/>
+          <w:b/>
+          <w:bCs/>
+          <w:u w:val="single"/>
+        </w:rPr>
+        <w:t xml:space="preserve"> </w:t>
+      </w:r>
+      <w:r>
+        <w:rPr>
+          <w:rFonts w:ascii="Calibri" w:hAnsi="Calibri" w:cs="Calibri"/>
+        </w:rPr>
+        <w:t xml:space="preserve">In the global </w:t>
+      </w:r>
+      <w:proofErr w:type="gramStart"/>
+      <w:r>
+        <w:rPr>
+          <w:rFonts w:ascii="Calibri" w:hAnsi="Calibri" w:cs="Calibri"/>
+        </w:rPr>
+        <w:t>scope(</w:t>
+      </w:r>
+      <w:proofErr w:type="gramEnd"/>
+      <w:r>
+        <w:rPr>
+          <w:rFonts w:ascii="Calibri" w:hAnsi="Calibri" w:cs="Calibri"/>
+        </w:rPr>
+        <w:t>outside of any function), this refers to the global object(window in browsers)</w:t>
+      </w:r>
+    </w:p>
+    <w:p>
+      <w:pPr>
+        <w:rPr>
+          <w:rFonts w:ascii="Calibri" w:hAnsi="Calibri" w:cs="Calibri"/>
+        </w:rPr>
+      </w:pPr>
+      <w:r>
+        <w:rPr>
+          <w:rFonts w:ascii="Calibri" w:hAnsi="Calibri" w:cs="Calibri"/>
+          <w:b/>
+          <w:bCs/>
+          <w:u w:val="single"/>
+        </w:rPr>
+        <w:t xml:space="preserve">Object Context: </w:t>
+      </w:r>
+      <w:r>
+        <w:rPr>
+          <w:rFonts w:ascii="Calibri" w:hAnsi="Calibri" w:cs="Calibri"/>
+        </w:rPr>
+        <w:t>Inside a method of an object, this refers to the object itself.</w:t>
+      </w:r>
+    </w:p>
+    <w:p>
+      <w:pPr>
+        <w:rPr>
+          <w:rFonts w:ascii="Calibri" w:hAnsi="Calibri" w:cs="Calibri"/>
+        </w:rPr>
+      </w:pPr>
+      <w:r>
+        <w:rPr>
+          <w:rFonts w:ascii="Calibri" w:hAnsi="Calibri" w:cs="Calibri"/>
+          <w:b/>
+          <w:bCs/>
+          <w:u w:val="single"/>
+        </w:rPr>
+        <w:t xml:space="preserve">Constructor  Function: </w:t>
+      </w:r>
+      <w:r>
+        <w:rPr>
+          <w:rFonts w:ascii="Calibri" w:hAnsi="Calibri" w:cs="Calibri"/>
+        </w:rPr>
+        <w:t>When used in a constructor function, this refers to new object being created.</w:t>
+      </w:r>
+    </w:p>
+    <w:p>
+      <w:pPr>
+        <w:rPr>
+          <w:rFonts w:ascii="Calibri" w:hAnsi="Calibri" w:cs="Calibri"/>
+        </w:rPr>
+      </w:pPr>
+      <w:r>
+        <w:rPr>
+          <w:rFonts w:ascii="Calibri" w:hAnsi="Calibri" w:cs="Calibri"/>
+          <w:b/>
+          <w:bCs/>
+          <w:u w:val="single"/>
+        </w:rPr>
+        <w:t xml:space="preserve">Arrow Function: </w:t>
+      </w:r>
+      <w:r>
+        <w:rPr>
+          <w:rFonts w:ascii="Calibri" w:hAnsi="Calibri" w:cs="Calibri"/>
+        </w:rPr>
+        <w:t>Arrow functions do not have their own this. They inherit this from the parent scope at the time they are defined.</w:t>
+      </w:r>
+    </w:p>
+    <w:p>
+      <w:pPr>
+        <w:jc w:val="center"/>
+        <w:rPr>
+          <w:rFonts w:ascii="Calibri" w:hAnsi="Calibri" w:cs="Calibri"/>
+          <w:b/>
+          <w:bCs/>
+          <w:u w:val="single"/>
+        </w:rPr>
+      </w:pPr>
+      <w:r>
+        <w:rPr>
+          <w:rFonts w:ascii="Calibri" w:hAnsi="Calibri" w:cs="Calibri"/>
+          <w:b/>
+          <w:bCs/>
+          <w:highlight w:val="yellow"/>
+          <w:u w:val="single"/>
+        </w:rPr>
+        <w:t>This with function method Members</w:t>
+      </w:r>
+    </w:p>
+    <w:p>
+      <w:pPr>
+        <w:pStyle w:val="ListParagraph"/>
+        <w:numPr>
+          <w:ilvl w:val="0"/>
+          <w:numId w:val="11"/>
+        </w:numPr>
+        <w:rPr>
+          <w:rFonts w:ascii="Calibri" w:hAnsi="Calibri" w:cs="Calibri"/>
+        </w:rPr>
+      </w:pPr>
+      <w:r>
+        <w:rPr>
+          <w:rFonts w:ascii="Calibri" w:hAnsi="Calibri" w:cs="Calibri"/>
+        </w:rPr>
+        <w:t xml:space="preserve">We have </w:t>
+      </w:r>
+      <w:r>
+        <w:rPr>
+          <w:rFonts w:ascii="Calibri" w:hAnsi="Calibri" w:cs="Calibri"/>
+        </w:rPr>
+        <w:t>call, apply and bind.</w:t>
+      </w:r>
+    </w:p>
+    <w:p>
+      <w:pPr>
+        <w:pStyle w:val="ListParagraph"/>
+        <w:numPr>
+          <w:ilvl w:val="0"/>
+          <w:numId w:val="11"/>
+        </w:numPr>
+        <w:rPr>
+          <w:rFonts w:ascii="Calibri" w:hAnsi="Calibri" w:cs="Calibri"/>
+        </w:rPr>
+      </w:pPr>
+      <w:r>
+        <w:rPr>
+          <w:rFonts w:ascii="Calibri" w:hAnsi="Calibri" w:cs="Calibri"/>
+        </w:rPr>
+        <w:t xml:space="preserve">In JS, functions come with built-in methods like </w:t>
+      </w:r>
+      <w:proofErr w:type="gramStart"/>
+      <w:r>
+        <w:rPr>
+          <w:rFonts w:ascii="Calibri" w:hAnsi="Calibri" w:cs="Calibri"/>
+        </w:rPr>
+        <w:t>call(</w:t>
+      </w:r>
+      <w:proofErr w:type="gramEnd"/>
+      <w:r>
+        <w:rPr>
+          <w:rFonts w:ascii="Calibri" w:hAnsi="Calibri" w:cs="Calibri"/>
+        </w:rPr>
+        <w:t xml:space="preserve">), bind() and apply() that allow you to control the context of this. </w:t>
+      </w:r>
+    </w:p>
+    <w:p>
+      <w:pPr>
+        <w:pStyle w:val="ListParagraph"/>
+        <w:numPr>
+          <w:ilvl w:val="0"/>
+          <w:numId w:val="11"/>
+        </w:numPr>
+        <w:rPr>
+          <w:rFonts w:ascii="Calibri" w:hAnsi="Calibri" w:cs="Calibri"/>
+        </w:rPr>
+      </w:pPr>
+      <w:proofErr w:type="gramStart"/>
+      <w:r>
+        <w:rPr>
+          <w:rFonts w:ascii="Calibri" w:hAnsi="Calibri" w:cs="Calibri"/>
+          <w:b/>
+          <w:bCs/>
+        </w:rPr>
+        <w:t>Call(</w:t>
+      </w:r>
+      <w:proofErr w:type="gramEnd"/>
+      <w:r>
+        <w:rPr>
+          <w:rFonts w:ascii="Calibri" w:hAnsi="Calibri" w:cs="Calibri"/>
+          <w:b/>
+          <w:bCs/>
+        </w:rPr>
+        <w:t>):</w:t>
+      </w:r>
+      <w:r>
+        <w:rPr>
+          <w:rFonts w:ascii="Calibri" w:hAnsi="Calibri" w:cs="Calibri"/>
+        </w:rPr>
+        <w:t xml:space="preserve"> this method immediately invokes the function with ‘this’ set to the provided value and any additional arguments passed individually.</w:t>
+      </w:r>
+    </w:p>
+    <w:p>
+      <w:pPr>
+        <w:pStyle w:val="ListParagraph"/>
+        <w:numPr>
+          <w:ilvl w:val="0"/>
+          <w:numId w:val="11"/>
+        </w:numPr>
+        <w:rPr>
+          <w:rFonts w:ascii="Calibri" w:hAnsi="Calibri" w:cs="Calibri"/>
+        </w:rPr>
+      </w:pPr>
+      <w:proofErr w:type="gramStart"/>
+      <w:r>
+        <w:rPr>
+          <w:rFonts w:ascii="Calibri" w:hAnsi="Calibri" w:cs="Calibri"/>
+          <w:b/>
+          <w:bCs/>
+        </w:rPr>
+        <w:t>Apply(</w:t>
+      </w:r>
+      <w:proofErr w:type="gramEnd"/>
+      <w:r>
+        <w:rPr>
+          <w:rFonts w:ascii="Calibri" w:hAnsi="Calibri" w:cs="Calibri"/>
+          <w:b/>
+          <w:bCs/>
+        </w:rPr>
+        <w:t>):</w:t>
+      </w:r>
+      <w:r>
+        <w:rPr>
+          <w:rFonts w:ascii="Calibri" w:hAnsi="Calibri" w:cs="Calibri"/>
+        </w:rPr>
+        <w:t xml:space="preserve"> The apply method works like call but takes an array of </w:t>
+      </w:r>
+      <w:proofErr w:type="spellStart"/>
+      <w:r>
+        <w:rPr>
+          <w:rFonts w:ascii="Calibri" w:hAnsi="Calibri" w:cs="Calibri"/>
+        </w:rPr>
+        <w:t>argumnts</w:t>
+      </w:r>
+      <w:proofErr w:type="spellEnd"/>
+      <w:r>
+        <w:rPr>
+          <w:rFonts w:ascii="Calibri" w:hAnsi="Calibri" w:cs="Calibri"/>
+        </w:rPr>
+        <w:t xml:space="preserve"> instead of passing them individually.</w:t>
+      </w:r>
+    </w:p>
+    <w:p>
+      <w:pPr>
+        <w:pStyle w:val="ListParagraph"/>
+        <w:numPr>
+          <w:ilvl w:val="0"/>
+          <w:numId w:val="11"/>
+        </w:numPr>
+        <w:rPr>
+          <w:rFonts w:ascii="Calibri" w:hAnsi="Calibri" w:cs="Calibri"/>
+        </w:rPr>
+      </w:pPr>
+      <w:proofErr w:type="gramStart"/>
+      <w:r>
+        <w:rPr>
+          <w:rFonts w:ascii="Calibri" w:hAnsi="Calibri" w:cs="Calibri"/>
+          <w:b/>
+          <w:bCs/>
+        </w:rPr>
+        <w:t>Bind(</w:t>
+      </w:r>
+      <w:proofErr w:type="gramEnd"/>
+      <w:r>
+        <w:rPr>
+          <w:rFonts w:ascii="Calibri" w:hAnsi="Calibri" w:cs="Calibri"/>
+          <w:b/>
+          <w:bCs/>
+        </w:rPr>
+        <w:t>):</w:t>
+      </w:r>
+      <w:r>
+        <w:rPr>
+          <w:rFonts w:ascii="Calibri" w:hAnsi="Calibri" w:cs="Calibri"/>
+        </w:rPr>
+        <w:t xml:space="preserve"> Bind method does not immediately call the function. Instead, it returns a new function with ‘this’ set to </w:t>
+      </w:r>
+      <w:r>
+        <w:rPr>
+          <w:rFonts w:ascii="Calibri" w:hAnsi="Calibri" w:cs="Calibri"/>
+        </w:rPr>
+        <w:t>the specified value and arguments present if provided.</w:t>
+      </w:r>
+    </w:p>
+    <w:p>
+      <w:pPr>
+        <w:rPr>
+          <w:rFonts w:ascii="Calibri" w:hAnsi="Calibri" w:cs="Calibri"/>
+        </w:rPr>
+      </w:pPr>
+    </w:p>
+    <w:p>
+      <w:pPr>
+        <w:rPr>
+          <w:rFonts w:ascii="Calibri" w:hAnsi="Calibri" w:cs="Calibri"/>
+        </w:rPr>
+      </w:pPr>
+    </w:p>
+    <w:p>
+      <w:pPr>
+        <w:ind w:left="1080"/>
+        <w:rPr>
+          <w:rFonts w:ascii="Calibri" w:hAnsi="Calibri" w:cs="Calibri"/>
+          <w:b/>
+          <w:bCs/>
+          <w:u w:val="single"/>
+        </w:rPr>
+      </w:pPr>
+    </w:p>
+    <w:p>
+      <w:pPr>
         <w:ind w:left="720"/>
         <w:rPr>
           <w:rFonts w:ascii="Calibri" w:hAnsi="Calibri" w:cs="Calibri"/>
@@ -6707,6 +7340,95 @@
     </w:lvl>
   </w:abstractNum>
   <w:abstractNum w:abstractNumId="2" w15:restartNumberingAfterBreak="0">
+    <w:nsid w:val="2F296187"/>
+    <w:multiLevelType w:val="hybridMultilevel"/>
+    <w:tmpl w:val="D5CED388"/>
+    <w:lvl w:ilvl="0" w:tplc="E0E2E4F2">
+      <w:start w:val="1"/>
+      <w:numFmt w:val="decimal"/>
+      <w:lvlText w:val="%1."/>
+      <w:lvlJc w:val="left"/>
+      <w:pPr>
+        <w:ind w:left="1440" w:hanging="360"/>
+      </w:pPr>
+      <w:rPr>
+        <w:rFonts w:hint="default"/>
+      </w:rPr>
+    </w:lvl>
+    <w:lvl w:ilvl="1" w:tplc="40090019" w:tentative="1">
+      <w:start w:val="1"/>
+      <w:numFmt w:val="lowerLetter"/>
+      <w:lvlText w:val="%2."/>
+      <w:lvlJc w:val="left"/>
+      <w:pPr>
+        <w:ind w:left="2160" w:hanging="360"/>
+      </w:pPr>
+    </w:lvl>
+    <w:lvl w:ilvl="2" w:tplc="4009001B" w:tentative="1">
+      <w:start w:val="1"/>
+      <w:numFmt w:val="lowerRoman"/>
+      <w:lvlText w:val="%3."/>
+      <w:lvlJc w:val="right"/>
+      <w:pPr>
+        <w:ind w:left="2880" w:hanging="180"/>
+      </w:pPr>
+    </w:lvl>
+    <w:lvl w:ilvl="3" w:tplc="4009000F" w:tentative="1">
+      <w:start w:val="1"/>
+      <w:numFmt w:val="decimal"/>
+      <w:lvlText w:val="%4."/>
+      <w:lvlJc w:val="left"/>
+      <w:pPr>
+        <w:ind w:left="3600" w:hanging="360"/>
+      </w:pPr>
+    </w:lvl>
+    <w:lvl w:ilvl="4" w:tplc="40090019" w:tentative="1">
+      <w:start w:val="1"/>
+      <w:numFmt w:val="lowerLetter"/>
+      <w:lvlText w:val="%5."/>
+      <w:lvlJc w:val="left"/>
+      <w:pPr>
+        <w:ind w:left="4320" w:hanging="360"/>
+      </w:pPr>
+    </w:lvl>
+    <w:lvl w:ilvl="5" w:tplc="4009001B" w:tentative="1">
+      <w:start w:val="1"/>
+      <w:numFmt w:val="lowerRoman"/>
+      <w:lvlText w:val="%6."/>
+      <w:lvlJc w:val="right"/>
+      <w:pPr>
+        <w:ind w:left="5040" w:hanging="180"/>
+      </w:pPr>
+    </w:lvl>
+    <w:lvl w:ilvl="6" w:tplc="4009000F" w:tentative="1">
+      <w:start w:val="1"/>
+      <w:numFmt w:val="decimal"/>
+      <w:lvlText w:val="%7."/>
+      <w:lvlJc w:val="left"/>
+      <w:pPr>
+        <w:ind w:left="5760" w:hanging="360"/>
+      </w:pPr>
+    </w:lvl>
+    <w:lvl w:ilvl="7" w:tplc="40090019" w:tentative="1">
+      <w:start w:val="1"/>
+      <w:numFmt w:val="lowerLetter"/>
+      <w:lvlText w:val="%8."/>
+      <w:lvlJc w:val="left"/>
+      <w:pPr>
+        <w:ind w:left="6480" w:hanging="360"/>
+      </w:pPr>
+    </w:lvl>
+    <w:lvl w:ilvl="8" w:tplc="4009001B" w:tentative="1">
+      <w:start w:val="1"/>
+      <w:numFmt w:val="lowerRoman"/>
+      <w:lvlText w:val="%9."/>
+      <w:lvlJc w:val="right"/>
+      <w:pPr>
+        <w:ind w:left="7200" w:hanging="180"/>
+      </w:pPr>
+    </w:lvl>
+  </w:abstractNum>
+  <w:abstractNum w:abstractNumId="3" w15:restartNumberingAfterBreak="0">
     <w:nsid w:val="3A6D1A56"/>
     <w:multiLevelType w:val="hybridMultilevel"/>
     <w:tmpl w:val="00FAF0CC"/>
@@ -6795,7 +7517,7 @@
       </w:pPr>
     </w:lvl>
   </w:abstractNum>
-  <w:abstractNum w:abstractNumId="3" w15:restartNumberingAfterBreak="0">
+  <w:abstractNum w:abstractNumId="4" w15:restartNumberingAfterBreak="0">
     <w:nsid w:val="3CC93DA0"/>
     <w:multiLevelType w:val="hybridMultilevel"/>
     <w:tmpl w:val="D304D14C"/>
@@ -6908,7 +7630,120 @@
       </w:rPr>
     </w:lvl>
   </w:abstractNum>
-  <w:abstractNum w:abstractNumId="4" w15:restartNumberingAfterBreak="0">
+  <w:abstractNum w:abstractNumId="5" w15:restartNumberingAfterBreak="0">
+    <w:nsid w:val="4F4A14CF"/>
+    <w:multiLevelType w:val="hybridMultilevel"/>
+    <w:tmpl w:val="07E4F688"/>
+    <w:lvl w:ilvl="0" w:tplc="40090001">
+      <w:start w:val="1"/>
+      <w:numFmt w:val="bullet"/>
+      <w:lvlText w:val=""/>
+      <w:lvlJc w:val="left"/>
+      <w:pPr>
+        <w:ind w:left="720" w:hanging="360"/>
+      </w:pPr>
+      <w:rPr>
+        <w:rFonts w:ascii="Symbol" w:hAnsi="Symbol" w:hint="default"/>
+      </w:rPr>
+    </w:lvl>
+    <w:lvl w:ilvl="1" w:tplc="40090003" w:tentative="1">
+      <w:start w:val="1"/>
+      <w:numFmt w:val="bullet"/>
+      <w:lvlText w:val="o"/>
+      <w:lvlJc w:val="left"/>
+      <w:pPr>
+        <w:ind w:left="1440" w:hanging="360"/>
+      </w:pPr>
+      <w:rPr>
+        <w:rFonts w:ascii="Courier New" w:hAnsi="Courier New" w:cs="Courier New" w:hint="default"/>
+      </w:rPr>
+    </w:lvl>
+    <w:lvl w:ilvl="2" w:tplc="40090005" w:tentative="1">
+      <w:start w:val="1"/>
+      <w:numFmt w:val="bullet"/>
+      <w:lvlText w:val=""/>
+      <w:lvlJc w:val="left"/>
+      <w:pPr>
+        <w:ind w:left="2160" w:hanging="360"/>
+      </w:pPr>
+      <w:rPr>
+        <w:rFonts w:ascii="Wingdings" w:hAnsi="Wingdings" w:hint="default"/>
+      </w:rPr>
+    </w:lvl>
+    <w:lvl w:ilvl="3" w:tplc="40090001" w:tentative="1">
+      <w:start w:val="1"/>
+      <w:numFmt w:val="bullet"/>
+      <w:lvlText w:val=""/>
+      <w:lvlJc w:val="left"/>
+      <w:pPr>
+        <w:ind w:left="2880" w:hanging="360"/>
+      </w:pPr>
+      <w:rPr>
+        <w:rFonts w:ascii="Symbol" w:hAnsi="Symbol" w:hint="default"/>
+      </w:rPr>
+    </w:lvl>
+    <w:lvl w:ilvl="4" w:tplc="40090003" w:tentative="1">
+      <w:start w:val="1"/>
+      <w:numFmt w:val="bullet"/>
+      <w:lvlText w:val="o"/>
+      <w:lvlJc w:val="left"/>
+      <w:pPr>
+        <w:ind w:left="3600" w:hanging="360"/>
+      </w:pPr>
+      <w:rPr>
+        <w:rFonts w:ascii="Courier New" w:hAnsi="Courier New" w:cs="Courier New" w:hint="default"/>
+      </w:rPr>
+    </w:lvl>
+    <w:lvl w:ilvl="5" w:tplc="40090005" w:tentative="1">
+      <w:start w:val="1"/>
+      <w:numFmt w:val="bullet"/>
+      <w:lvlText w:val=""/>
+      <w:lvlJc w:val="left"/>
+      <w:pPr>
+        <w:ind w:left="4320" w:hanging="360"/>
+      </w:pPr>
+      <w:rPr>
+        <w:rFonts w:ascii="Wingdings" w:hAnsi="Wingdings" w:hint="default"/>
+      </w:rPr>
+    </w:lvl>
+    <w:lvl w:ilvl="6" w:tplc="40090001" w:tentative="1">
+      <w:start w:val="1"/>
+      <w:numFmt w:val="bullet"/>
+      <w:lvlText w:val=""/>
+      <w:lvlJc w:val="left"/>
+      <w:pPr>
+        <w:ind w:left="5040" w:hanging="360"/>
+      </w:pPr>
+      <w:rPr>
+        <w:rFonts w:ascii="Symbol" w:hAnsi="Symbol" w:hint="default"/>
+      </w:rPr>
+    </w:lvl>
+    <w:lvl w:ilvl="7" w:tplc="40090003" w:tentative="1">
+      <w:start w:val="1"/>
+      <w:numFmt w:val="bullet"/>
+      <w:lvlText w:val="o"/>
+      <w:lvlJc w:val="left"/>
+      <w:pPr>
+        <w:ind w:left="5760" w:hanging="360"/>
+      </w:pPr>
+      <w:rPr>
+        <w:rFonts w:ascii="Courier New" w:hAnsi="Courier New" w:cs="Courier New" w:hint="default"/>
+      </w:rPr>
+    </w:lvl>
+    <w:lvl w:ilvl="8" w:tplc="40090005" w:tentative="1">
+      <w:start w:val="1"/>
+      <w:numFmt w:val="bullet"/>
+      <w:lvlText w:val=""/>
+      <w:lvlJc w:val="left"/>
+      <w:pPr>
+        <w:ind w:left="6480" w:hanging="360"/>
+      </w:pPr>
+      <w:rPr>
+        <w:rFonts w:ascii="Wingdings" w:hAnsi="Wingdings" w:hint="default"/>
+      </w:rPr>
+    </w:lvl>
+  </w:abstractNum>
+  <w:abstractNum w:abstractNumId="6" w15:restartNumberingAfterBreak="0">
     <w:nsid w:val="57A10B6C"/>
     <w:multiLevelType w:val="multilevel"/>
     <w:tmpl w:val="99B43B9C"/>
@@ -7057,7 +7892,7 @@
       </w:rPr>
     </w:lvl>
   </w:abstractNum>
-  <w:abstractNum w:abstractNumId="5" w15:restartNumberingAfterBreak="0">
+  <w:abstractNum w:abstractNumId="7" w15:restartNumberingAfterBreak="0">
     <w:nsid w:val="5AD857E4"/>
     <w:multiLevelType w:val="hybridMultilevel"/>
     <w:tmpl w:val="BDB0B4B0"/>
@@ -7146,7 +7981,7 @@
       </w:pPr>
     </w:lvl>
   </w:abstractNum>
-  <w:abstractNum w:abstractNumId="6" w15:restartNumberingAfterBreak="0">
+  <w:abstractNum w:abstractNumId="8" w15:restartNumberingAfterBreak="0">
     <w:nsid w:val="5B1D424A"/>
     <w:multiLevelType w:val="multilevel"/>
     <w:tmpl w:val="B59A427A"/>
@@ -7295,7 +8130,7 @@
       </w:rPr>
     </w:lvl>
   </w:abstractNum>
-  <w:abstractNum w:abstractNumId="7" w15:restartNumberingAfterBreak="0">
+  <w:abstractNum w:abstractNumId="9" w15:restartNumberingAfterBreak="0">
     <w:nsid w:val="6D2D2F38"/>
     <w:multiLevelType w:val="hybridMultilevel"/>
     <w:tmpl w:val="6FFE06A4"/>
@@ -7408,7 +8243,7 @@
       </w:rPr>
     </w:lvl>
   </w:abstractNum>
-  <w:abstractNum w:abstractNumId="8" w15:restartNumberingAfterBreak="0">
+  <w:abstractNum w:abstractNumId="10" w15:restartNumberingAfterBreak="0">
     <w:nsid w:val="7DBF6609"/>
     <w:multiLevelType w:val="hybridMultilevel"/>
     <w:tmpl w:val="F9FE1900"/>
@@ -7498,22 +8333,22 @@
     </w:lvl>
   </w:abstractNum>
   <w:num w:numId="1" w16cid:durableId="595099240">
+    <w:abstractNumId w:val="6"/>
+  </w:num>
+  <w:num w:numId="2" w16cid:durableId="1813980021">
+    <w:abstractNumId w:val="8"/>
+  </w:num>
+  <w:num w:numId="3" w16cid:durableId="937519047">
+    <w:abstractNumId w:val="3"/>
+  </w:num>
+  <w:num w:numId="4" w16cid:durableId="430515380">
     <w:abstractNumId w:val="4"/>
   </w:num>
-  <w:num w:numId="2" w16cid:durableId="1813980021">
-    <w:abstractNumId w:val="6"/>
-  </w:num>
-  <w:num w:numId="3" w16cid:durableId="937519047">
-    <w:abstractNumId w:val="2"/>
-  </w:num>
-  <w:num w:numId="4" w16cid:durableId="430515380">
-    <w:abstractNumId w:val="3"/>
-  </w:num>
   <w:num w:numId="5" w16cid:durableId="1899049412">
-    <w:abstractNumId w:val="5"/>
+    <w:abstractNumId w:val="7"/>
   </w:num>
   <w:num w:numId="6" w16cid:durableId="115565957">
-    <w:abstractNumId w:val="7"/>
+    <w:abstractNumId w:val="9"/>
   </w:num>
   <w:num w:numId="7" w16cid:durableId="1758986486">
     <w:abstractNumId w:val="0"/>
@@ -7522,7 +8357,13 @@
     <w:abstractNumId w:val="1"/>
   </w:num>
   <w:num w:numId="9" w16cid:durableId="1833255551">
-    <w:abstractNumId w:val="8"/>
+    <w:abstractNumId w:val="10"/>
+  </w:num>
+  <w:num w:numId="10" w16cid:durableId="1398700903">
+    <w:abstractNumId w:val="2"/>
+  </w:num>
+  <w:num w:numId="11" w16cid:durableId="1386368196">
+    <w:abstractNumId w:val="5"/>
   </w:num>
 </w:numbering>
 </file>

</xml_diff>